<commit_message>
Add final report PDF, Turnitin receipt, and system code explanation
</commit_message>
<xml_diff>
--- a/Documentation/Docx versions/Aayam Regmi(77466864) - Initial Project Plan.docx
+++ b/Documentation/Docx versions/Aayam Regmi(77466864) - Initial Project Plan.docx
@@ -5939,6 +5939,14 @@
                 <w:szCs w:val="24"/>
               </w:rPr>
               <w:t xml:space="preserve">Role: </w:t>
+            </w:r>
+            <w:r>
+              <w:rPr>
+                <w:rFonts w:asciiTheme="minorHAnsi" w:hAnsiTheme="minorHAnsi" w:cstheme="minorHAnsi"/>
+                <w:sz w:val="24"/>
+                <w:szCs w:val="24"/>
+              </w:rPr>
+              <w:t>Researcher</w:t>
             </w:r>
           </w:p>
           <w:p>

</xml_diff>